<commit_message>
caeb adversary-complaint: single-spaced lines set in 12 pt, solid on their 12 pt pitch, in typst and docx; 13 pt type there printed each line into the next (DEF-FORM-004) (fb-595.87)
Co-Authored-By: Claude Opus 5.5 <noreply@anthropic.com>
Gate: run-1029014735-57659 7e84754cc84de04fb501d36311e95bdcc0c6cede
</commit_message>
<xml_diff>
--- a/courts/ninth-circuit/california/federal/bankruptcy-eastern-district/adversary-complaint/usage/OUTPUT-adversary-complaint.docx
+++ b/courts/ninth-circuit/california/federal/bankruptcy-eastern-district/adversary-complaint/usage/OUTPUT-adversary-complaint.docx
@@ -9,24 +9,52 @@
         <w:jc w:val="left"/>
       </w:pPr>
       <w:r>
+        <w:rPr>
+          <w:sz w:val="24"/>
+          <w:szCs w:val="24"/>
+        </w:rPr>
         <w:t xml:space="preserve">SHANNA</w:t>
       </w:r>
       <w:r>
-        <w:t xml:space="preserve"> </w:t>
-      </w:r>
-      <w:r>
+        <w:rPr>
+          <w:sz w:val="24"/>
+          <w:szCs w:val="24"/>
+        </w:rPr>
+        <w:t xml:space="preserve"> </w:t>
+      </w:r>
+      <w:r>
+        <w:rPr>
+          <w:sz w:val="24"/>
+          <w:szCs w:val="24"/>
+        </w:rPr>
         <w:t xml:space="preserve">M.</w:t>
       </w:r>
       <w:r>
-        <w:t xml:space="preserve"> </w:t>
-      </w:r>
-      <w:r>
+        <w:rPr>
+          <w:sz w:val="24"/>
+          <w:szCs w:val="24"/>
+        </w:rPr>
+        <w:t xml:space="preserve"> </w:t>
+      </w:r>
+      <w:r>
+        <w:rPr>
+          <w:sz w:val="24"/>
+          <w:szCs w:val="24"/>
+        </w:rPr>
         <w:t xml:space="preserve">KAMINSKI</w:t>
       </w:r>
       <w:r>
-        <w:t xml:space="preserve"> </w:t>
-      </w:r>
-      <w:r>
+        <w:rPr>
+          <w:sz w:val="24"/>
+          <w:szCs w:val="24"/>
+        </w:rPr>
+        <w:t xml:space="preserve"> </w:t>
+      </w:r>
+      <w:r>
+        <w:rPr>
+          <w:sz w:val="24"/>
+          <w:szCs w:val="24"/>
+        </w:rPr>
         <w:t xml:space="preserve">(P74013)</w:t>
       </w:r>
     </w:p>
@@ -40,6 +68,8 @@
         <w:rPr>
           <w:i/>
           <w:iCs/>
+          <w:sz w:val="24"/>
+          <w:szCs w:val="24"/>
         </w:rPr>
         <w:t xml:space="preserve">Admitted</w:t>
       </w:r>
@@ -47,6 +77,8 @@
         <w:rPr>
           <w:i/>
           <w:iCs/>
+          <w:sz w:val="24"/>
+          <w:szCs w:val="24"/>
         </w:rPr>
         <w:t xml:space="preserve"> </w:t>
       </w:r>
@@ -54,6 +86,8 @@
         <w:rPr>
           <w:i/>
           <w:iCs/>
+          <w:sz w:val="24"/>
+          <w:szCs w:val="24"/>
         </w:rPr>
         <w:t xml:space="preserve">Pro</w:t>
       </w:r>
@@ -61,6 +95,8 @@
         <w:rPr>
           <w:i/>
           <w:iCs/>
+          <w:sz w:val="24"/>
+          <w:szCs w:val="24"/>
         </w:rPr>
         <w:t xml:space="preserve"> </w:t>
       </w:r>
@@ -68,6 +104,8 @@
         <w:rPr>
           <w:i/>
           <w:iCs/>
+          <w:sz w:val="24"/>
+          <w:szCs w:val="24"/>
         </w:rPr>
         <w:t xml:space="preserve">Hac</w:t>
       </w:r>
@@ -75,6 +113,8 @@
         <w:rPr>
           <w:i/>
           <w:iCs/>
+          <w:sz w:val="24"/>
+          <w:szCs w:val="24"/>
         </w:rPr>
         <w:t xml:space="preserve"> </w:t>
       </w:r>
@@ -82,6 +122,8 @@
         <w:rPr>
           <w:i/>
           <w:iCs/>
+          <w:sz w:val="24"/>
+          <w:szCs w:val="24"/>
         </w:rPr>
         <w:t xml:space="preserve">Vice</w:t>
       </w:r>
@@ -93,18 +135,38 @@
         <w:jc w:val="left"/>
       </w:pPr>
       <w:r>
+        <w:rPr>
+          <w:sz w:val="24"/>
+          <w:szCs w:val="24"/>
+        </w:rPr>
         <w:t xml:space="preserve">KAMINSKI</w:t>
       </w:r>
       <w:r>
-        <w:t xml:space="preserve"> </w:t>
-      </w:r>
-      <w:r>
+        <w:rPr>
+          <w:sz w:val="24"/>
+          <w:szCs w:val="24"/>
+        </w:rPr>
+        <w:t xml:space="preserve"> </w:t>
+      </w:r>
+      <w:r>
+        <w:rPr>
+          <w:sz w:val="24"/>
+          <w:szCs w:val="24"/>
+        </w:rPr>
         <w:t xml:space="preserve">LAW,</w:t>
       </w:r>
       <w:r>
-        <w:t xml:space="preserve"> </w:t>
-      </w:r>
-      <w:r>
+        <w:rPr>
+          <w:sz w:val="24"/>
+          <w:szCs w:val="24"/>
+        </w:rPr>
+        <w:t xml:space="preserve"> </w:t>
+      </w:r>
+      <w:r>
+        <w:rPr>
+          <w:sz w:val="24"/>
+          <w:szCs w:val="24"/>
+        </w:rPr>
         <w:t xml:space="preserve">PLLC</w:t>
       </w:r>
     </w:p>
@@ -115,18 +177,38 @@
         <w:jc w:val="left"/>
       </w:pPr>
       <w:r>
+        <w:rPr>
+          <w:sz w:val="24"/>
+          <w:szCs w:val="24"/>
+        </w:rPr>
         <w:t xml:space="preserve">PO</w:t>
       </w:r>
       <w:r>
-        <w:t xml:space="preserve"> </w:t>
-      </w:r>
-      <w:r>
+        <w:rPr>
+          <w:sz w:val="24"/>
+          <w:szCs w:val="24"/>
+        </w:rPr>
+        <w:t xml:space="preserve"> </w:t>
+      </w:r>
+      <w:r>
+        <w:rPr>
+          <w:sz w:val="24"/>
+          <w:szCs w:val="24"/>
+        </w:rPr>
         <w:t xml:space="preserve">Box</w:t>
       </w:r>
       <w:r>
-        <w:t xml:space="preserve"> </w:t>
-      </w:r>
-      <w:r>
+        <w:rPr>
+          <w:sz w:val="24"/>
+          <w:szCs w:val="24"/>
+        </w:rPr>
+        <w:t xml:space="preserve"> </w:t>
+      </w:r>
+      <w:r>
+        <w:rPr>
+          <w:sz w:val="24"/>
+          <w:szCs w:val="24"/>
+        </w:rPr>
         <w:t xml:space="preserve">247</w:t>
       </w:r>
     </w:p>
@@ -137,27 +219,53 @@
         <w:jc w:val="left"/>
       </w:pPr>
       <w:r>
+        <w:rPr>
+          <w:sz w:val="24"/>
+          <w:szCs w:val="24"/>
+        </w:rPr>
         <w:t xml:space="preserve">Grass</w:t>
       </w:r>
       <w:r>
-        <w:t xml:space="preserve"> </w:t>
-      </w:r>
-      <w:r>
+        <w:rPr>
+          <w:sz w:val="24"/>
+          <w:szCs w:val="24"/>
+        </w:rPr>
+        <w:t xml:space="preserve"> </w:t>
+      </w:r>
+      <w:r>
+        <w:rPr>
+          <w:sz w:val="24"/>
+          <w:szCs w:val="24"/>
+        </w:rPr>
         <w:t xml:space="preserve">Lake,</w:t>
       </w:r>
       <w:r>
-        <w:t xml:space="preserve"> </w:t>
-      </w:r>
-      <w:r>
+        <w:rPr>
+          <w:sz w:val="24"/>
+          <w:szCs w:val="24"/>
+        </w:rPr>
+        <w:t xml:space="preserve"> </w:t>
+      </w:r>
+      <w:r>
+        <w:rPr>
+          <w:sz w:val="24"/>
+          <w:szCs w:val="24"/>
+        </w:rPr>
         <w:t xml:space="preserve">Michigan</w:t>
       </w:r>
       <w:r>
-        <w:t xml:space="preserve"> </w:t>
-      </w:r>
-      <w:r>
-        <w:t xml:space="preserve">49240</w:t>
-        <w:noBreakHyphen/>
-        <w:t xml:space="preserve">0247</w:t>
+        <w:rPr>
+          <w:sz w:val="24"/>
+          <w:szCs w:val="24"/>
+        </w:rPr>
+        <w:t xml:space="preserve"> </w:t>
+      </w:r>
+      <w:r>
+        <w:rPr>
+          <w:sz w:val="24"/>
+          <w:szCs w:val="24"/>
+        </w:rPr>
+        <w:t xml:space="preserve">49240-⁠0247</w:t>
       </w:r>
     </w:p>
     <w:p>
@@ -167,21 +275,39 @@
         <w:jc w:val="left"/>
       </w:pPr>
       <w:r>
+        <w:rPr>
+          <w:sz w:val="24"/>
+          <w:szCs w:val="24"/>
+        </w:rPr>
         <w:t xml:space="preserve">Telephone:</w:t>
       </w:r>
       <w:r>
-        <w:t xml:space="preserve"> </w:t>
-      </w:r>
-      <w:r>
+        <w:rPr>
+          <w:sz w:val="24"/>
+          <w:szCs w:val="24"/>
+        </w:rPr>
+        <w:t xml:space="preserve"> </w:t>
+      </w:r>
+      <w:r>
+        <w:rPr>
+          <w:sz w:val="24"/>
+          <w:szCs w:val="24"/>
+        </w:rPr>
         <w:t xml:space="preserve">(247)</w:t>
       </w:r>
       <w:r>
-        <w:t xml:space="preserve"> </w:t>
-      </w:r>
-      <w:r>
-        <w:t xml:space="preserve">462</w:t>
-        <w:noBreakHyphen/>
-        <w:t xml:space="preserve">7111</w:t>
+        <w:rPr>
+          <w:sz w:val="24"/>
+          <w:szCs w:val="24"/>
+        </w:rPr>
+        <w:t xml:space="preserve"> </w:t>
+      </w:r>
+      <w:r>
+        <w:rPr>
+          <w:sz w:val="24"/>
+          <w:szCs w:val="24"/>
+        </w:rPr>
+        <w:t xml:space="preserve">462-⁠7111</w:t>
       </w:r>
     </w:p>
     <w:p>
@@ -191,6 +317,10 @@
         <w:jc w:val="left"/>
       </w:pPr>
       <w:r>
+        <w:rPr>
+          <w:sz w:val="24"/>
+          <w:szCs w:val="24"/>
+        </w:rPr>
         <w:t xml:space="preserve">skaminski@kaminskilawpllc.com</w:t>
       </w:r>
     </w:p>
@@ -201,36 +331,80 @@
         <w:jc w:val="left"/>
       </w:pPr>
       <w:r>
+        <w:rPr>
+          <w:sz w:val="24"/>
+          <w:szCs w:val="24"/>
+        </w:rPr>
         <w:t xml:space="preserve">Attorneys</w:t>
       </w:r>
       <w:r>
-        <w:t xml:space="preserve"> </w:t>
-      </w:r>
-      <w:r>
+        <w:rPr>
+          <w:sz w:val="24"/>
+          <w:szCs w:val="24"/>
+        </w:rPr>
+        <w:t xml:space="preserve"> </w:t>
+      </w:r>
+      <w:r>
+        <w:rPr>
+          <w:sz w:val="24"/>
+          <w:szCs w:val="24"/>
+        </w:rPr>
         <w:t xml:space="preserve">for</w:t>
       </w:r>
       <w:r>
-        <w:t xml:space="preserve"> </w:t>
-      </w:r>
-      <w:r>
+        <w:rPr>
+          <w:sz w:val="24"/>
+          <w:szCs w:val="24"/>
+        </w:rPr>
+        <w:t xml:space="preserve"> </w:t>
+      </w:r>
+      <w:r>
+        <w:rPr>
+          <w:sz w:val="24"/>
+          <w:szCs w:val="24"/>
+        </w:rPr>
         <w:t xml:space="preserve">Plaintiff</w:t>
       </w:r>
       <w:r>
-        <w:t xml:space="preserve"> </w:t>
-      </w:r>
-      <w:r>
+        <w:rPr>
+          <w:sz w:val="24"/>
+          <w:szCs w:val="24"/>
+        </w:rPr>
+        <w:t xml:space="preserve"> </w:t>
+      </w:r>
+      <w:r>
+        <w:rPr>
+          <w:sz w:val="24"/>
+          <w:szCs w:val="24"/>
+        </w:rPr>
         <w:t xml:space="preserve">DLP</w:t>
       </w:r>
       <w:r>
-        <w:t xml:space="preserve"> </w:t>
-      </w:r>
-      <w:r>
+        <w:rPr>
+          <w:sz w:val="24"/>
+          <w:szCs w:val="24"/>
+        </w:rPr>
+        <w:t xml:space="preserve"> </w:t>
+      </w:r>
+      <w:r>
+        <w:rPr>
+          <w:sz w:val="24"/>
+          <w:szCs w:val="24"/>
+        </w:rPr>
         <w:t xml:space="preserve">FUNDING</w:t>
       </w:r>
       <w:r>
-        <w:t xml:space="preserve"> </w:t>
-      </w:r>
-      <w:r>
+        <w:rPr>
+          <w:sz w:val="24"/>
+          <w:szCs w:val="24"/>
+        </w:rPr>
+        <w:t xml:space="preserve"> </w:t>
+      </w:r>
+      <w:r>
+        <w:rPr>
+          <w:sz w:val="24"/>
+          <w:szCs w:val="24"/>
+        </w:rPr>
         <w:t xml:space="preserve">LLC</w:t>
       </w:r>
     </w:p>
@@ -241,30 +415,66 @@
         <w:jc w:val="left"/>
       </w:pPr>
       <w:r>
+        <w:rPr>
+          <w:sz w:val="24"/>
+          <w:szCs w:val="24"/>
+        </w:rPr>
         <w:t xml:space="preserve">GREGORY</w:t>
       </w:r>
       <w:r>
-        <w:t xml:space="preserve"> </w:t>
-      </w:r>
-      <w:r>
+        <w:rPr>
+          <w:sz w:val="24"/>
+          <w:szCs w:val="24"/>
+        </w:rPr>
+        <w:t xml:space="preserve"> </w:t>
+      </w:r>
+      <w:r>
+        <w:rPr>
+          <w:sz w:val="24"/>
+          <w:szCs w:val="24"/>
+        </w:rPr>
         <w:t xml:space="preserve">M.</w:t>
       </w:r>
       <w:r>
-        <w:t xml:space="preserve"> </w:t>
-      </w:r>
-      <w:r>
+        <w:rPr>
+          <w:sz w:val="24"/>
+          <w:szCs w:val="24"/>
+        </w:rPr>
+        <w:t xml:space="preserve"> </w:t>
+      </w:r>
+      <w:r>
+        <w:rPr>
+          <w:sz w:val="24"/>
+          <w:szCs w:val="24"/>
+        </w:rPr>
         <w:t xml:space="preserve">SALVATO</w:t>
       </w:r>
       <w:r>
-        <w:t xml:space="preserve"> </w:t>
-      </w:r>
-      <w:r>
+        <w:rPr>
+          <w:sz w:val="24"/>
+          <w:szCs w:val="24"/>
+        </w:rPr>
+        <w:t xml:space="preserve"> </w:t>
+      </w:r>
+      <w:r>
+        <w:rPr>
+          <w:sz w:val="24"/>
+          <w:szCs w:val="24"/>
+        </w:rPr>
         <w:t xml:space="preserve">(SBN</w:t>
       </w:r>
       <w:r>
-        <w:t xml:space="preserve"> </w:t>
-      </w:r>
-      <w:r>
+        <w:rPr>
+          <w:sz w:val="24"/>
+          <w:szCs w:val="24"/>
+        </w:rPr>
+        <w:t xml:space="preserve"> </w:t>
+      </w:r>
+      <w:r>
+        <w:rPr>
+          <w:sz w:val="24"/>
+          <w:szCs w:val="24"/>
+        </w:rPr>
         <w:t xml:space="preserve">126285)</w:t>
       </w:r>
     </w:p>
@@ -275,24 +485,52 @@
         <w:jc w:val="left"/>
       </w:pPr>
       <w:r>
+        <w:rPr>
+          <w:sz w:val="24"/>
+          <w:szCs w:val="24"/>
+        </w:rPr>
         <w:t xml:space="preserve">JOSEPH</w:t>
       </w:r>
       <w:r>
-        <w:t xml:space="preserve"> </w:t>
-      </w:r>
-      <w:r>
+        <w:rPr>
+          <w:sz w:val="24"/>
+          <w:szCs w:val="24"/>
+        </w:rPr>
+        <w:t xml:space="preserve"> </w:t>
+      </w:r>
+      <w:r>
+        <w:rPr>
+          <w:sz w:val="24"/>
+          <w:szCs w:val="24"/>
+        </w:rPr>
         <w:t xml:space="preserve">BOUFADEL</w:t>
       </w:r>
       <w:r>
-        <w:t xml:space="preserve"> </w:t>
-      </w:r>
-      <w:r>
+        <w:rPr>
+          <w:sz w:val="24"/>
+          <w:szCs w:val="24"/>
+        </w:rPr>
+        <w:t xml:space="preserve"> </w:t>
+      </w:r>
+      <w:r>
+        <w:rPr>
+          <w:sz w:val="24"/>
+          <w:szCs w:val="24"/>
+        </w:rPr>
         <w:t xml:space="preserve">(SBN</w:t>
       </w:r>
       <w:r>
-        <w:t xml:space="preserve"> </w:t>
-      </w:r>
-      <w:r>
+        <w:rPr>
+          <w:sz w:val="24"/>
+          <w:szCs w:val="24"/>
+        </w:rPr>
+        <w:t xml:space="preserve"> </w:t>
+      </w:r>
+      <w:r>
+        <w:rPr>
+          <w:sz w:val="24"/>
+          <w:szCs w:val="24"/>
+        </w:rPr>
         <w:t xml:space="preserve">267312)</w:t>
       </w:r>
     </w:p>
@@ -303,18 +541,38 @@
         <w:jc w:val="left"/>
       </w:pPr>
       <w:r>
+        <w:rPr>
+          <w:sz w:val="24"/>
+          <w:szCs w:val="24"/>
+        </w:rPr>
         <w:t xml:space="preserve">SALVATO</w:t>
       </w:r>
       <w:r>
-        <w:t xml:space="preserve"> </w:t>
-      </w:r>
-      <w:r>
+        <w:rPr>
+          <w:sz w:val="24"/>
+          <w:szCs w:val="24"/>
+        </w:rPr>
+        <w:t xml:space="preserve"> </w:t>
+      </w:r>
+      <w:r>
+        <w:rPr>
+          <w:sz w:val="24"/>
+          <w:szCs w:val="24"/>
+        </w:rPr>
         <w:t xml:space="preserve">BOUFADEL</w:t>
       </w:r>
       <w:r>
-        <w:t xml:space="preserve"> </w:t>
-      </w:r>
-      <w:r>
+        <w:rPr>
+          <w:sz w:val="24"/>
+          <w:szCs w:val="24"/>
+        </w:rPr>
+        <w:t xml:space="preserve"> </w:t>
+      </w:r>
+      <w:r>
+        <w:rPr>
+          <w:sz w:val="24"/>
+          <w:szCs w:val="24"/>
+        </w:rPr>
         <w:t xml:space="preserve">LLP</w:t>
       </w:r>
     </w:p>
@@ -325,36 +583,80 @@
         <w:jc w:val="left"/>
       </w:pPr>
       <w:r>
+        <w:rPr>
+          <w:sz w:val="24"/>
+          <w:szCs w:val="24"/>
+        </w:rPr>
         <w:t xml:space="preserve">355</w:t>
       </w:r>
       <w:r>
-        <w:t xml:space="preserve"> </w:t>
-      </w:r>
-      <w:r>
+        <w:rPr>
+          <w:sz w:val="24"/>
+          <w:szCs w:val="24"/>
+        </w:rPr>
+        <w:t xml:space="preserve"> </w:t>
+      </w:r>
+      <w:r>
+        <w:rPr>
+          <w:sz w:val="24"/>
+          <w:szCs w:val="24"/>
+        </w:rPr>
         <w:t xml:space="preserve">South</w:t>
       </w:r>
       <w:r>
-        <w:t xml:space="preserve"> </w:t>
-      </w:r>
-      <w:r>
+        <w:rPr>
+          <w:sz w:val="24"/>
+          <w:szCs w:val="24"/>
+        </w:rPr>
+        <w:t xml:space="preserve"> </w:t>
+      </w:r>
+      <w:r>
+        <w:rPr>
+          <w:sz w:val="24"/>
+          <w:szCs w:val="24"/>
+        </w:rPr>
         <w:t xml:space="preserve">Grand</w:t>
       </w:r>
       <w:r>
-        <w:t xml:space="preserve"> </w:t>
-      </w:r>
-      <w:r>
+        <w:rPr>
+          <w:sz w:val="24"/>
+          <w:szCs w:val="24"/>
+        </w:rPr>
+        <w:t xml:space="preserve"> </w:t>
+      </w:r>
+      <w:r>
+        <w:rPr>
+          <w:sz w:val="24"/>
+          <w:szCs w:val="24"/>
+        </w:rPr>
         <w:t xml:space="preserve">Avenue,</w:t>
       </w:r>
       <w:r>
-        <w:t xml:space="preserve"> </w:t>
-      </w:r>
-      <w:r>
+        <w:rPr>
+          <w:sz w:val="24"/>
+          <w:szCs w:val="24"/>
+        </w:rPr>
+        <w:t xml:space="preserve"> </w:t>
+      </w:r>
+      <w:r>
+        <w:rPr>
+          <w:sz w:val="24"/>
+          <w:szCs w:val="24"/>
+        </w:rPr>
         <w:t xml:space="preserve">Suite</w:t>
       </w:r>
       <w:r>
-        <w:t xml:space="preserve"> </w:t>
-      </w:r>
-      <w:r>
+        <w:rPr>
+          <w:sz w:val="24"/>
+          <w:szCs w:val="24"/>
+        </w:rPr>
+        <w:t xml:space="preserve"> </w:t>
+      </w:r>
+      <w:r>
+        <w:rPr>
+          <w:sz w:val="24"/>
+          <w:szCs w:val="24"/>
+        </w:rPr>
         <w:t xml:space="preserve">2450</w:t>
       </w:r>
     </w:p>
@@ -365,24 +667,52 @@
         <w:jc w:val="left"/>
       </w:pPr>
       <w:r>
+        <w:rPr>
+          <w:sz w:val="24"/>
+          <w:szCs w:val="24"/>
+        </w:rPr>
         <w:t xml:space="preserve">Los</w:t>
       </w:r>
       <w:r>
-        <w:t xml:space="preserve"> </w:t>
-      </w:r>
-      <w:r>
+        <w:rPr>
+          <w:sz w:val="24"/>
+          <w:szCs w:val="24"/>
+        </w:rPr>
+        <w:t xml:space="preserve"> </w:t>
+      </w:r>
+      <w:r>
+        <w:rPr>
+          <w:sz w:val="24"/>
+          <w:szCs w:val="24"/>
+        </w:rPr>
         <w:t xml:space="preserve">Angeles,</w:t>
       </w:r>
       <w:r>
-        <w:t xml:space="preserve"> </w:t>
-      </w:r>
-      <w:r>
+        <w:rPr>
+          <w:sz w:val="24"/>
+          <w:szCs w:val="24"/>
+        </w:rPr>
+        <w:t xml:space="preserve"> </w:t>
+      </w:r>
+      <w:r>
+        <w:rPr>
+          <w:sz w:val="24"/>
+          <w:szCs w:val="24"/>
+        </w:rPr>
         <w:t xml:space="preserve">California</w:t>
       </w:r>
       <w:r>
-        <w:t xml:space="preserve"> </w:t>
-      </w:r>
-      <w:r>
+        <w:rPr>
+          <w:sz w:val="24"/>
+          <w:szCs w:val="24"/>
+        </w:rPr>
+        <w:t xml:space="preserve"> </w:t>
+      </w:r>
+      <w:r>
+        <w:rPr>
+          <w:sz w:val="24"/>
+          <w:szCs w:val="24"/>
+        </w:rPr>
         <w:t xml:space="preserve">90071</w:t>
       </w:r>
     </w:p>
@@ -393,21 +723,39 @@
         <w:jc w:val="left"/>
       </w:pPr>
       <w:r>
+        <w:rPr>
+          <w:sz w:val="24"/>
+          <w:szCs w:val="24"/>
+        </w:rPr>
         <w:t xml:space="preserve">Telephone:</w:t>
       </w:r>
       <w:r>
-        <w:t xml:space="preserve"> </w:t>
-      </w:r>
-      <w:r>
+        <w:rPr>
+          <w:sz w:val="24"/>
+          <w:szCs w:val="24"/>
+        </w:rPr>
+        <w:t xml:space="preserve"> </w:t>
+      </w:r>
+      <w:r>
+        <w:rPr>
+          <w:sz w:val="24"/>
+          <w:szCs w:val="24"/>
+        </w:rPr>
         <w:t xml:space="preserve">(213)</w:t>
       </w:r>
       <w:r>
-        <w:t xml:space="preserve"> </w:t>
-      </w:r>
-      <w:r>
-        <w:t xml:space="preserve">423</w:t>
-        <w:noBreakHyphen/>
-        <w:t xml:space="preserve">0931</w:t>
+        <w:rPr>
+          <w:sz w:val="24"/>
+          <w:szCs w:val="24"/>
+        </w:rPr>
+        <w:t xml:space="preserve"> </w:t>
+      </w:r>
+      <w:r>
+        <w:rPr>
+          <w:sz w:val="24"/>
+          <w:szCs w:val="24"/>
+        </w:rPr>
+        <w:t xml:space="preserve">423-⁠0931</w:t>
       </w:r>
     </w:p>
     <w:p>
@@ -417,6 +765,10 @@
         <w:jc w:val="left"/>
       </w:pPr>
       <w:r>
+        <w:rPr>
+          <w:sz w:val="24"/>
+          <w:szCs w:val="24"/>
+        </w:rPr>
         <w:t xml:space="preserve">Gsalvato@salvatoboufadel.com</w:t>
       </w:r>
     </w:p>
@@ -427,6 +779,10 @@
         <w:jc w:val="left"/>
       </w:pPr>
       <w:r>
+        <w:rPr>
+          <w:sz w:val="24"/>
+          <w:szCs w:val="24"/>
+        </w:rPr>
         <w:t xml:space="preserve">Jboufadel@salvatoboufadel.com</w:t>
       </w:r>
     </w:p>
@@ -437,42 +793,94 @@
         <w:jc w:val="left"/>
       </w:pPr>
       <w:r>
+        <w:rPr>
+          <w:sz w:val="24"/>
+          <w:szCs w:val="24"/>
+        </w:rPr>
         <w:t xml:space="preserve">Local</w:t>
       </w:r>
       <w:r>
-        <w:t xml:space="preserve"> </w:t>
-      </w:r>
-      <w:r>
+        <w:rPr>
+          <w:sz w:val="24"/>
+          <w:szCs w:val="24"/>
+        </w:rPr>
+        <w:t xml:space="preserve"> </w:t>
+      </w:r>
+      <w:r>
+        <w:rPr>
+          <w:sz w:val="24"/>
+          <w:szCs w:val="24"/>
+        </w:rPr>
         <w:t xml:space="preserve">Counsel</w:t>
       </w:r>
       <w:r>
-        <w:t xml:space="preserve"> </w:t>
-      </w:r>
-      <w:r>
+        <w:rPr>
+          <w:sz w:val="24"/>
+          <w:szCs w:val="24"/>
+        </w:rPr>
+        <w:t xml:space="preserve"> </w:t>
+      </w:r>
+      <w:r>
+        <w:rPr>
+          <w:sz w:val="24"/>
+          <w:szCs w:val="24"/>
+        </w:rPr>
         <w:t xml:space="preserve">for</w:t>
       </w:r>
       <w:r>
-        <w:t xml:space="preserve"> </w:t>
-      </w:r>
-      <w:r>
+        <w:rPr>
+          <w:sz w:val="24"/>
+          <w:szCs w:val="24"/>
+        </w:rPr>
+        <w:t xml:space="preserve"> </w:t>
+      </w:r>
+      <w:r>
+        <w:rPr>
+          <w:sz w:val="24"/>
+          <w:szCs w:val="24"/>
+        </w:rPr>
         <w:t xml:space="preserve">Plaintiff</w:t>
       </w:r>
       <w:r>
-        <w:t xml:space="preserve"> </w:t>
-      </w:r>
-      <w:r>
+        <w:rPr>
+          <w:sz w:val="24"/>
+          <w:szCs w:val="24"/>
+        </w:rPr>
+        <w:t xml:space="preserve"> </w:t>
+      </w:r>
+      <w:r>
+        <w:rPr>
+          <w:sz w:val="24"/>
+          <w:szCs w:val="24"/>
+        </w:rPr>
         <w:t xml:space="preserve">DLP</w:t>
       </w:r>
       <w:r>
-        <w:t xml:space="preserve"> </w:t>
-      </w:r>
-      <w:r>
+        <w:rPr>
+          <w:sz w:val="24"/>
+          <w:szCs w:val="24"/>
+        </w:rPr>
+        <w:t xml:space="preserve"> </w:t>
+      </w:r>
+      <w:r>
+        <w:rPr>
+          <w:sz w:val="24"/>
+          <w:szCs w:val="24"/>
+        </w:rPr>
         <w:t xml:space="preserve">FUNDING</w:t>
       </w:r>
       <w:r>
-        <w:t xml:space="preserve"> </w:t>
-      </w:r>
-      <w:r>
+        <w:rPr>
+          <w:sz w:val="24"/>
+          <w:szCs w:val="24"/>
+        </w:rPr>
+        <w:t xml:space="preserve"> </w:t>
+      </w:r>
+      <w:r>
+        <w:rPr>
+          <w:sz w:val="24"/>
+          <w:szCs w:val="24"/>
+        </w:rPr>
         <w:t xml:space="preserve">LLC</w:t>
       </w:r>
     </w:p>
@@ -657,12 +1065,24 @@
               <w:jc w:val="left"/>
             </w:pPr>
             <w:r>
+              <w:rPr>
+                <w:sz w:val="24"/>
+                <w:szCs w:val="24"/>
+              </w:rPr>
               <w:t xml:space="preserve">In</w:t>
             </w:r>
             <w:r>
+              <w:rPr>
+                <w:sz w:val="24"/>
+                <w:szCs w:val="24"/>
+              </w:rPr>
               <w:t xml:space="preserve"> </w:t>
             </w:r>
             <w:r>
+              <w:rPr>
+                <w:sz w:val="24"/>
+                <w:szCs w:val="24"/>
+              </w:rPr>
               <w:t xml:space="preserve">re:</w:t>
             </w:r>
           </w:p>
@@ -673,42 +1093,94 @@
               <w:jc w:val="left"/>
             </w:pPr>
             <w:r>
+              <w:rPr>
+                <w:sz w:val="24"/>
+                <w:szCs w:val="24"/>
+              </w:rPr>
               <w:t xml:space="preserve">HRONIS,</w:t>
             </w:r>
             <w:r>
+              <w:rPr>
+                <w:sz w:val="24"/>
+                <w:szCs w:val="24"/>
+              </w:rPr>
               <w:t xml:space="preserve"> </w:t>
             </w:r>
             <w:r>
+              <w:rPr>
+                <w:sz w:val="24"/>
+                <w:szCs w:val="24"/>
+              </w:rPr>
               <w:t xml:space="preserve">INC.,</w:t>
             </w:r>
             <w:r>
+              <w:rPr>
+                <w:sz w:val="24"/>
+                <w:szCs w:val="24"/>
+              </w:rPr>
               <w:t xml:space="preserve"> </w:t>
             </w:r>
             <w:r>
+              <w:rPr>
+                <w:sz w:val="24"/>
+                <w:szCs w:val="24"/>
+              </w:rPr>
               <w:t xml:space="preserve">a</w:t>
             </w:r>
             <w:r>
+              <w:rPr>
+                <w:sz w:val="24"/>
+                <w:szCs w:val="24"/>
+              </w:rPr>
               <w:t xml:space="preserve"> </w:t>
             </w:r>
             <w:r>
+              <w:rPr>
+                <w:sz w:val="24"/>
+                <w:szCs w:val="24"/>
+              </w:rPr>
               <w:t xml:space="preserve">California</w:t>
             </w:r>
             <w:r>
+              <w:rPr>
+                <w:sz w:val="24"/>
+                <w:szCs w:val="24"/>
+              </w:rPr>
               <w:t xml:space="preserve"> </w:t>
             </w:r>
             <w:r>
+              <w:rPr>
+                <w:sz w:val="24"/>
+                <w:szCs w:val="24"/>
+              </w:rPr>
               <w:t xml:space="preserve">corporation,</w:t>
             </w:r>
             <w:r>
+              <w:rPr>
+                <w:sz w:val="24"/>
+                <w:szCs w:val="24"/>
+              </w:rPr>
               <w:t xml:space="preserve"> </w:t>
             </w:r>
             <w:r>
+              <w:rPr>
+                <w:sz w:val="24"/>
+                <w:szCs w:val="24"/>
+              </w:rPr>
               <w:t xml:space="preserve">et</w:t>
             </w:r>
             <w:r>
+              <w:rPr>
+                <w:sz w:val="24"/>
+                <w:szCs w:val="24"/>
+              </w:rPr>
               <w:t xml:space="preserve"> </w:t>
             </w:r>
             <w:r>
+              <w:rPr>
+                <w:sz w:val="24"/>
+                <w:szCs w:val="24"/>
+              </w:rPr>
               <w:t xml:space="preserve">al.,</w:t>
             </w:r>
           </w:p>
@@ -719,6 +1191,10 @@
               <w:jc w:val="left"/>
             </w:pPr>
             <w:r>
+              <w:rPr>
+                <w:sz w:val="24"/>
+                <w:szCs w:val="24"/>
+              </w:rPr>
               <w:t xml:space="preserve">Debtors-in-Possession.</w:t>
             </w:r>
           </w:p>
@@ -748,21 +1224,39 @@
               <w:jc w:val="left"/>
             </w:pPr>
             <w:r>
+              <w:rPr>
+                <w:sz w:val="24"/>
+                <w:szCs w:val="24"/>
+              </w:rPr>
               <w:t xml:space="preserve">Case</w:t>
             </w:r>
             <w:r>
+              <w:rPr>
+                <w:sz w:val="24"/>
+                <w:szCs w:val="24"/>
+              </w:rPr>
               <w:t xml:space="preserve"> </w:t>
             </w:r>
             <w:r>
+              <w:rPr>
+                <w:sz w:val="24"/>
+                <w:szCs w:val="24"/>
+              </w:rPr>
               <w:t xml:space="preserve">No.</w:t>
             </w:r>
             <w:r>
+              <w:rPr>
+                <w:sz w:val="24"/>
+                <w:szCs w:val="24"/>
+              </w:rPr>
               <w:t xml:space="preserve"> </w:t>
             </w:r>
             <w:r>
-              <w:t xml:space="preserve">1:26-bk</w:t>
-              <w:noBreakHyphen/>
-              <w:t xml:space="preserve">10978</w:t>
+              <w:rPr>
+                <w:sz w:val="24"/>
+                <w:szCs w:val="24"/>
+              </w:rPr>
+              <w:t xml:space="preserve">1:26-bk-⁠10978</w:t>
             </w:r>
           </w:p>
           <w:p>
@@ -772,12 +1266,24 @@
               <w:jc w:val="left"/>
             </w:pPr>
             <w:r>
+              <w:rPr>
+                <w:sz w:val="24"/>
+                <w:szCs w:val="24"/>
+              </w:rPr>
               <w:t xml:space="preserve">(Jointly</w:t>
             </w:r>
             <w:r>
+              <w:rPr>
+                <w:sz w:val="24"/>
+                <w:szCs w:val="24"/>
+              </w:rPr>
               <w:t xml:space="preserve"> </w:t>
             </w:r>
             <w:r>
+              <w:rPr>
+                <w:sz w:val="24"/>
+                <w:szCs w:val="24"/>
+              </w:rPr>
               <w:t xml:space="preserve">Administered)</w:t>
             </w:r>
           </w:p>
@@ -788,12 +1294,24 @@
               <w:jc w:val="left"/>
             </w:pPr>
             <w:r>
+              <w:rPr>
+                <w:sz w:val="24"/>
+                <w:szCs w:val="24"/>
+              </w:rPr>
               <w:t xml:space="preserve">Chapter</w:t>
             </w:r>
             <w:r>
+              <w:rPr>
+                <w:sz w:val="24"/>
+                <w:szCs w:val="24"/>
+              </w:rPr>
               <w:t xml:space="preserve"> </w:t>
             </w:r>
             <w:r>
+              <w:rPr>
+                <w:sz w:val="24"/>
+                <w:szCs w:val="24"/>
+              </w:rPr>
               <w:t xml:space="preserve">11</w:t>
             </w:r>
           </w:p>
@@ -804,6 +1322,10 @@
               <w:jc w:val="left"/>
             </w:pPr>
             <w:r>
+              <w:rPr>
+                <w:sz w:val="24"/>
+                <w:szCs w:val="24"/>
+              </w:rPr>
               <w:t xml:space="preserve">Adv. Proc. No.: </w:t>
             </w:r>
           </w:p>
@@ -817,6 +1339,8 @@
               <w:rPr>
                 <w:b/>
                 <w:bCs/>
+                <w:sz w:val="24"/>
+                <w:szCs w:val="24"/>
               </w:rPr>
               <w:t xml:space="preserve">COMPLAINT</w:t>
             </w:r>
@@ -824,6 +1348,8 @@
               <w:rPr>
                 <w:b/>
                 <w:bCs/>
+                <w:sz w:val="24"/>
+                <w:szCs w:val="24"/>
               </w:rPr>
               <w:t xml:space="preserve"> </w:t>
             </w:r>
@@ -831,6 +1357,8 @@
               <w:rPr>
                 <w:b/>
                 <w:bCs/>
+                <w:sz w:val="24"/>
+                <w:szCs w:val="24"/>
               </w:rPr>
               <w:t xml:space="preserve">TO</w:t>
             </w:r>
@@ -838,6 +1366,8 @@
               <w:rPr>
                 <w:b/>
                 <w:bCs/>
+                <w:sz w:val="24"/>
+                <w:szCs w:val="24"/>
               </w:rPr>
               <w:t xml:space="preserve"> </w:t>
             </w:r>
@@ -845,6 +1375,8 @@
               <w:rPr>
                 <w:b/>
                 <w:bCs/>
+                <w:sz w:val="24"/>
+                <w:szCs w:val="24"/>
               </w:rPr>
               <w:t xml:space="preserve">DETERMINE</w:t>
             </w:r>
@@ -852,6 +1384,8 @@
               <w:rPr>
                 <w:b/>
                 <w:bCs/>
+                <w:sz w:val="24"/>
+                <w:szCs w:val="24"/>
               </w:rPr>
               <w:t xml:space="preserve"> </w:t>
             </w:r>
@@ -859,6 +1393,8 @@
               <w:rPr>
                 <w:b/>
                 <w:bCs/>
+                <w:sz w:val="24"/>
+                <w:szCs w:val="24"/>
               </w:rPr>
               <w:t xml:space="preserve">INTEREST</w:t>
             </w:r>
@@ -866,6 +1402,8 @@
               <w:rPr>
                 <w:b/>
                 <w:bCs/>
+                <w:sz w:val="24"/>
+                <w:szCs w:val="24"/>
               </w:rPr>
               <w:t xml:space="preserve"> </w:t>
             </w:r>
@@ -873,6 +1411,8 @@
               <w:rPr>
                 <w:b/>
                 <w:bCs/>
+                <w:sz w:val="24"/>
+                <w:szCs w:val="24"/>
               </w:rPr>
               <w:t xml:space="preserve">IN</w:t>
             </w:r>
@@ -880,6 +1420,8 @@
               <w:rPr>
                 <w:b/>
                 <w:bCs/>
+                <w:sz w:val="24"/>
+                <w:szCs w:val="24"/>
               </w:rPr>
               <w:t xml:space="preserve"> </w:t>
             </w:r>
@@ -887,6 +1429,8 @@
               <w:rPr>
                 <w:b/>
                 <w:bCs/>
+                <w:sz w:val="24"/>
+                <w:szCs w:val="24"/>
               </w:rPr>
               <w:t xml:space="preserve">PROPERTY</w:t>
             </w:r>
@@ -894,6 +1438,8 @@
               <w:rPr>
                 <w:b/>
                 <w:bCs/>
+                <w:sz w:val="24"/>
+                <w:szCs w:val="24"/>
               </w:rPr>
               <w:t xml:space="preserve"> </w:t>
             </w:r>
@@ -901,6 +1447,8 @@
               <w:rPr>
                 <w:b/>
                 <w:bCs/>
+                <w:sz w:val="24"/>
+                <w:szCs w:val="24"/>
               </w:rPr>
               <w:t xml:space="preserve">OF</w:t>
             </w:r>
@@ -908,6 +1456,8 @@
               <w:rPr>
                 <w:b/>
                 <w:bCs/>
+                <w:sz w:val="24"/>
+                <w:szCs w:val="24"/>
               </w:rPr>
               <w:t xml:space="preserve"> </w:t>
             </w:r>
@@ -915,6 +1465,8 @@
               <w:rPr>
                 <w:b/>
                 <w:bCs/>
+                <w:sz w:val="24"/>
+                <w:szCs w:val="24"/>
               </w:rPr>
               <w:t xml:space="preserve">PRE-PETITION</w:t>
             </w:r>
@@ -922,6 +1474,8 @@
               <w:rPr>
                 <w:b/>
                 <w:bCs/>
+                <w:sz w:val="24"/>
+                <w:szCs w:val="24"/>
               </w:rPr>
               <w:t xml:space="preserve"> </w:t>
             </w:r>
@@ -929,6 +1483,8 @@
               <w:rPr>
                 <w:b/>
                 <w:bCs/>
+                <w:sz w:val="24"/>
+                <w:szCs w:val="24"/>
               </w:rPr>
               <w:t xml:space="preserve">ACCOUNTS</w:t>
             </w:r>
@@ -936,6 +1492,8 @@
               <w:rPr>
                 <w:b/>
                 <w:bCs/>
+                <w:sz w:val="24"/>
+                <w:szCs w:val="24"/>
               </w:rPr>
               <w:t xml:space="preserve"> </w:t>
             </w:r>
@@ -943,6 +1501,8 @@
               <w:rPr>
                 <w:b/>
                 <w:bCs/>
+                <w:sz w:val="24"/>
+                <w:szCs w:val="24"/>
               </w:rPr>
               <w:t xml:space="preserve">AND</w:t>
             </w:r>
@@ -950,6 +1510,8 @@
               <w:rPr>
                 <w:b/>
                 <w:bCs/>
+                <w:sz w:val="24"/>
+                <w:szCs w:val="24"/>
               </w:rPr>
               <w:t xml:space="preserve"> </w:t>
             </w:r>
@@ -957,6 +1519,8 @@
               <w:rPr>
                 <w:b/>
                 <w:bCs/>
+                <w:sz w:val="24"/>
+                <w:szCs w:val="24"/>
               </w:rPr>
               <w:t xml:space="preserve">RELATED</w:t>
             </w:r>
@@ -964,6 +1528,8 @@
               <w:rPr>
                 <w:b/>
                 <w:bCs/>
+                <w:sz w:val="24"/>
+                <w:szCs w:val="24"/>
               </w:rPr>
               <w:t xml:space="preserve"> </w:t>
             </w:r>
@@ -971,6 +1537,8 @@
               <w:rPr>
                 <w:b/>
                 <w:bCs/>
+                <w:sz w:val="24"/>
+                <w:szCs w:val="24"/>
               </w:rPr>
               <w:t xml:space="preserve">RELIEF</w:t>
             </w:r>
@@ -999,54 +1567,122 @@
               <w:jc w:val="left"/>
             </w:pPr>
             <w:r>
+              <w:rPr>
+                <w:sz w:val="24"/>
+                <w:szCs w:val="24"/>
+              </w:rPr>
               <w:t xml:space="preserve">DLP</w:t>
             </w:r>
             <w:r>
+              <w:rPr>
+                <w:sz w:val="24"/>
+                <w:szCs w:val="24"/>
+              </w:rPr>
               <w:t xml:space="preserve"> </w:t>
             </w:r>
             <w:r>
+              <w:rPr>
+                <w:sz w:val="24"/>
+                <w:szCs w:val="24"/>
+              </w:rPr>
               <w:t xml:space="preserve">FUNDING</w:t>
             </w:r>
             <w:r>
+              <w:rPr>
+                <w:sz w:val="24"/>
+                <w:szCs w:val="24"/>
+              </w:rPr>
               <w:t xml:space="preserve"> </w:t>
             </w:r>
             <w:r>
+              <w:rPr>
+                <w:sz w:val="24"/>
+                <w:szCs w:val="24"/>
+              </w:rPr>
               <w:t xml:space="preserve">LLC,</w:t>
             </w:r>
             <w:r>
+              <w:rPr>
+                <w:sz w:val="24"/>
+                <w:szCs w:val="24"/>
+              </w:rPr>
               <w:t xml:space="preserve"> </w:t>
             </w:r>
             <w:r>
+              <w:rPr>
+                <w:sz w:val="24"/>
+                <w:szCs w:val="24"/>
+              </w:rPr>
               <w:t xml:space="preserve">a</w:t>
             </w:r>
             <w:r>
+              <w:rPr>
+                <w:sz w:val="24"/>
+                <w:szCs w:val="24"/>
+              </w:rPr>
               <w:t xml:space="preserve"> </w:t>
             </w:r>
             <w:r>
+              <w:rPr>
+                <w:sz w:val="24"/>
+                <w:szCs w:val="24"/>
+              </w:rPr>
               <w:t xml:space="preserve">New</w:t>
             </w:r>
             <w:r>
+              <w:rPr>
+                <w:sz w:val="24"/>
+                <w:szCs w:val="24"/>
+              </w:rPr>
               <w:t xml:space="preserve"> </w:t>
             </w:r>
             <w:r>
+              <w:rPr>
+                <w:sz w:val="24"/>
+                <w:szCs w:val="24"/>
+              </w:rPr>
               <w:t xml:space="preserve">York</w:t>
             </w:r>
             <w:r>
+              <w:rPr>
+                <w:sz w:val="24"/>
+                <w:szCs w:val="24"/>
+              </w:rPr>
               <w:t xml:space="preserve"> </w:t>
             </w:r>
             <w:r>
+              <w:rPr>
+                <w:sz w:val="24"/>
+                <w:szCs w:val="24"/>
+              </w:rPr>
               <w:t xml:space="preserve">limited</w:t>
             </w:r>
             <w:r>
+              <w:rPr>
+                <w:sz w:val="24"/>
+                <w:szCs w:val="24"/>
+              </w:rPr>
               <w:t xml:space="preserve"> </w:t>
             </w:r>
             <w:r>
+              <w:rPr>
+                <w:sz w:val="24"/>
+                <w:szCs w:val="24"/>
+              </w:rPr>
               <w:t xml:space="preserve">liability</w:t>
             </w:r>
             <w:r>
+              <w:rPr>
+                <w:sz w:val="24"/>
+                <w:szCs w:val="24"/>
+              </w:rPr>
               <w:t xml:space="preserve"> </w:t>
             </w:r>
             <w:r>
+              <w:rPr>
+                <w:sz w:val="24"/>
+                <w:szCs w:val="24"/>
+              </w:rPr>
               <w:t xml:space="preserve">company;</w:t>
             </w:r>
           </w:p>
@@ -1057,6 +1693,10 @@
               <w:jc w:val="left"/>
             </w:pPr>
             <w:r>
+              <w:rPr>
+                <w:sz w:val="24"/>
+                <w:szCs w:val="24"/>
+              </w:rPr>
               <w:t xml:space="preserve">Plaintiff,</w:t>
             </w:r>
           </w:p>
@@ -1067,6 +1707,10 @@
               <w:jc w:val="left"/>
             </w:pPr>
             <w:r>
+              <w:rPr>
+                <w:sz w:val="24"/>
+                <w:szCs w:val="24"/>
+              </w:rPr>
               <w:t xml:space="preserve">v.</w:t>
             </w:r>
           </w:p>
@@ -1077,216 +1721,500 @@
               <w:jc w:val="left"/>
             </w:pPr>
             <w:r>
+              <w:rPr>
+                <w:sz w:val="24"/>
+                <w:szCs w:val="24"/>
+              </w:rPr>
               <w:t xml:space="preserve">HRONIS,</w:t>
             </w:r>
             <w:r>
+              <w:rPr>
+                <w:sz w:val="24"/>
+                <w:szCs w:val="24"/>
+              </w:rPr>
               <w:t xml:space="preserve"> </w:t>
             </w:r>
             <w:r>
+              <w:rPr>
+                <w:sz w:val="24"/>
+                <w:szCs w:val="24"/>
+              </w:rPr>
               <w:t xml:space="preserve">INC.,</w:t>
             </w:r>
             <w:r>
+              <w:rPr>
+                <w:sz w:val="24"/>
+                <w:szCs w:val="24"/>
+              </w:rPr>
               <w:t xml:space="preserve"> </w:t>
             </w:r>
             <w:r>
+              <w:rPr>
+                <w:sz w:val="24"/>
+                <w:szCs w:val="24"/>
+              </w:rPr>
               <w:t xml:space="preserve">a</w:t>
             </w:r>
             <w:r>
+              <w:rPr>
+                <w:sz w:val="24"/>
+                <w:szCs w:val="24"/>
+              </w:rPr>
               <w:t xml:space="preserve"> </w:t>
             </w:r>
             <w:r>
+              <w:rPr>
+                <w:sz w:val="24"/>
+                <w:szCs w:val="24"/>
+              </w:rPr>
               <w:t xml:space="preserve">California</w:t>
             </w:r>
             <w:r>
+              <w:rPr>
+                <w:sz w:val="24"/>
+                <w:szCs w:val="24"/>
+              </w:rPr>
               <w:t xml:space="preserve"> </w:t>
             </w:r>
             <w:r>
+              <w:rPr>
+                <w:sz w:val="24"/>
+                <w:szCs w:val="24"/>
+              </w:rPr>
               <w:t xml:space="preserve">corporation;</w:t>
             </w:r>
             <w:r>
+              <w:rPr>
+                <w:sz w:val="24"/>
+                <w:szCs w:val="24"/>
+              </w:rPr>
               <w:t xml:space="preserve"> </w:t>
             </w:r>
             <w:r>
+              <w:rPr>
+                <w:sz w:val="24"/>
+                <w:szCs w:val="24"/>
+              </w:rPr>
               <w:t xml:space="preserve">HRONIS</w:t>
             </w:r>
             <w:r>
+              <w:rPr>
+                <w:sz w:val="24"/>
+                <w:szCs w:val="24"/>
+              </w:rPr>
               <w:t xml:space="preserve"> </w:t>
             </w:r>
             <w:r>
+              <w:rPr>
+                <w:sz w:val="24"/>
+                <w:szCs w:val="24"/>
+              </w:rPr>
               <w:t xml:space="preserve">FRUIT</w:t>
             </w:r>
             <w:r>
+              <w:rPr>
+                <w:sz w:val="24"/>
+                <w:szCs w:val="24"/>
+              </w:rPr>
               <w:t xml:space="preserve"> </w:t>
             </w:r>
             <w:r>
+              <w:rPr>
+                <w:sz w:val="24"/>
+                <w:szCs w:val="24"/>
+              </w:rPr>
               <w:t xml:space="preserve">COMPANY</w:t>
             </w:r>
             <w:r>
+              <w:rPr>
+                <w:sz w:val="24"/>
+                <w:szCs w:val="24"/>
+              </w:rPr>
               <w:t xml:space="preserve"> </w:t>
             </w:r>
             <w:r>
+              <w:rPr>
+                <w:sz w:val="24"/>
+                <w:szCs w:val="24"/>
+              </w:rPr>
               <w:t xml:space="preserve">LLC,</w:t>
             </w:r>
             <w:r>
+              <w:rPr>
+                <w:sz w:val="24"/>
+                <w:szCs w:val="24"/>
+              </w:rPr>
               <w:t xml:space="preserve"> </w:t>
             </w:r>
             <w:r>
+              <w:rPr>
+                <w:sz w:val="24"/>
+                <w:szCs w:val="24"/>
+              </w:rPr>
               <w:t xml:space="preserve">a</w:t>
             </w:r>
             <w:r>
+              <w:rPr>
+                <w:sz w:val="24"/>
+                <w:szCs w:val="24"/>
+              </w:rPr>
               <w:t xml:space="preserve"> </w:t>
             </w:r>
             <w:r>
+              <w:rPr>
+                <w:sz w:val="24"/>
+                <w:szCs w:val="24"/>
+              </w:rPr>
               <w:t xml:space="preserve">California</w:t>
             </w:r>
             <w:r>
+              <w:rPr>
+                <w:sz w:val="24"/>
+                <w:szCs w:val="24"/>
+              </w:rPr>
               <w:t xml:space="preserve"> </w:t>
             </w:r>
             <w:r>
+              <w:rPr>
+                <w:sz w:val="24"/>
+                <w:szCs w:val="24"/>
+              </w:rPr>
               <w:t xml:space="preserve">limited</w:t>
             </w:r>
             <w:r>
+              <w:rPr>
+                <w:sz w:val="24"/>
+                <w:szCs w:val="24"/>
+              </w:rPr>
               <w:t xml:space="preserve"> </w:t>
             </w:r>
             <w:r>
+              <w:rPr>
+                <w:sz w:val="24"/>
+                <w:szCs w:val="24"/>
+              </w:rPr>
               <w:t xml:space="preserve">liability</w:t>
             </w:r>
             <w:r>
+              <w:rPr>
+                <w:sz w:val="24"/>
+                <w:szCs w:val="24"/>
+              </w:rPr>
               <w:t xml:space="preserve"> </w:t>
             </w:r>
             <w:r>
+              <w:rPr>
+                <w:sz w:val="24"/>
+                <w:szCs w:val="24"/>
+              </w:rPr>
               <w:t xml:space="preserve">company;</w:t>
             </w:r>
             <w:r>
+              <w:rPr>
+                <w:sz w:val="24"/>
+                <w:szCs w:val="24"/>
+              </w:rPr>
               <w:t xml:space="preserve"> </w:t>
             </w:r>
             <w:r>
+              <w:rPr>
+                <w:sz w:val="24"/>
+                <w:szCs w:val="24"/>
+              </w:rPr>
               <w:t xml:space="preserve">HRONIS</w:t>
             </w:r>
             <w:r>
+              <w:rPr>
+                <w:sz w:val="24"/>
+                <w:szCs w:val="24"/>
+              </w:rPr>
               <w:t xml:space="preserve"> </w:t>
             </w:r>
             <w:r>
+              <w:rPr>
+                <w:sz w:val="24"/>
+                <w:szCs w:val="24"/>
+              </w:rPr>
               <w:t xml:space="preserve">RANCH,</w:t>
             </w:r>
             <w:r>
+              <w:rPr>
+                <w:sz w:val="24"/>
+                <w:szCs w:val="24"/>
+              </w:rPr>
               <w:t xml:space="preserve"> </w:t>
             </w:r>
             <w:r>
+              <w:rPr>
+                <w:sz w:val="24"/>
+                <w:szCs w:val="24"/>
+              </w:rPr>
               <w:t xml:space="preserve">LLC,</w:t>
             </w:r>
             <w:r>
+              <w:rPr>
+                <w:sz w:val="24"/>
+                <w:szCs w:val="24"/>
+              </w:rPr>
               <w:t xml:space="preserve"> </w:t>
             </w:r>
             <w:r>
+              <w:rPr>
+                <w:sz w:val="24"/>
+                <w:szCs w:val="24"/>
+              </w:rPr>
               <w:t xml:space="preserve">a</w:t>
             </w:r>
             <w:r>
+              <w:rPr>
+                <w:sz w:val="24"/>
+                <w:szCs w:val="24"/>
+              </w:rPr>
               <w:t xml:space="preserve"> </w:t>
             </w:r>
             <w:r>
+              <w:rPr>
+                <w:sz w:val="24"/>
+                <w:szCs w:val="24"/>
+              </w:rPr>
               <w:t xml:space="preserve">California</w:t>
             </w:r>
             <w:r>
+              <w:rPr>
+                <w:sz w:val="24"/>
+                <w:szCs w:val="24"/>
+              </w:rPr>
               <w:t xml:space="preserve"> </w:t>
             </w:r>
             <w:r>
+              <w:rPr>
+                <w:sz w:val="24"/>
+                <w:szCs w:val="24"/>
+              </w:rPr>
               <w:t xml:space="preserve">limited</w:t>
             </w:r>
             <w:r>
+              <w:rPr>
+                <w:sz w:val="24"/>
+                <w:szCs w:val="24"/>
+              </w:rPr>
               <w:t xml:space="preserve"> </w:t>
             </w:r>
             <w:r>
+              <w:rPr>
+                <w:sz w:val="24"/>
+                <w:szCs w:val="24"/>
+              </w:rPr>
               <w:t xml:space="preserve">liability</w:t>
             </w:r>
             <w:r>
+              <w:rPr>
+                <w:sz w:val="24"/>
+                <w:szCs w:val="24"/>
+              </w:rPr>
               <w:t xml:space="preserve"> </w:t>
             </w:r>
             <w:r>
+              <w:rPr>
+                <w:sz w:val="24"/>
+                <w:szCs w:val="24"/>
+              </w:rPr>
               <w:t xml:space="preserve">company;</w:t>
             </w:r>
             <w:r>
+              <w:rPr>
+                <w:sz w:val="24"/>
+                <w:szCs w:val="24"/>
+              </w:rPr>
               <w:t xml:space="preserve"> </w:t>
             </w:r>
             <w:r>
+              <w:rPr>
+                <w:sz w:val="24"/>
+                <w:szCs w:val="24"/>
+              </w:rPr>
               <w:t xml:space="preserve">HRONIS</w:t>
             </w:r>
             <w:r>
+              <w:rPr>
+                <w:sz w:val="24"/>
+                <w:szCs w:val="24"/>
+              </w:rPr>
               <w:t xml:space="preserve"> </w:t>
             </w:r>
             <w:r>
+              <w:rPr>
+                <w:sz w:val="24"/>
+                <w:szCs w:val="24"/>
+              </w:rPr>
               <w:t xml:space="preserve">CITRUS,</w:t>
             </w:r>
             <w:r>
+              <w:rPr>
+                <w:sz w:val="24"/>
+                <w:szCs w:val="24"/>
+              </w:rPr>
               <w:t xml:space="preserve"> </w:t>
             </w:r>
             <w:r>
+              <w:rPr>
+                <w:sz w:val="24"/>
+                <w:szCs w:val="24"/>
+              </w:rPr>
               <w:t xml:space="preserve">LLC,</w:t>
             </w:r>
             <w:r>
+              <w:rPr>
+                <w:sz w:val="24"/>
+                <w:szCs w:val="24"/>
+              </w:rPr>
               <w:t xml:space="preserve"> </w:t>
             </w:r>
             <w:r>
+              <w:rPr>
+                <w:sz w:val="24"/>
+                <w:szCs w:val="24"/>
+              </w:rPr>
               <w:t xml:space="preserve">a</w:t>
             </w:r>
             <w:r>
+              <w:rPr>
+                <w:sz w:val="24"/>
+                <w:szCs w:val="24"/>
+              </w:rPr>
               <w:t xml:space="preserve"> </w:t>
             </w:r>
             <w:r>
+              <w:rPr>
+                <w:sz w:val="24"/>
+                <w:szCs w:val="24"/>
+              </w:rPr>
               <w:t xml:space="preserve">California</w:t>
             </w:r>
             <w:r>
+              <w:rPr>
+                <w:sz w:val="24"/>
+                <w:szCs w:val="24"/>
+              </w:rPr>
               <w:t xml:space="preserve"> </w:t>
             </w:r>
             <w:r>
+              <w:rPr>
+                <w:sz w:val="24"/>
+                <w:szCs w:val="24"/>
+              </w:rPr>
               <w:t xml:space="preserve">limited</w:t>
             </w:r>
             <w:r>
+              <w:rPr>
+                <w:sz w:val="24"/>
+                <w:szCs w:val="24"/>
+              </w:rPr>
               <w:t xml:space="preserve"> </w:t>
             </w:r>
             <w:r>
+              <w:rPr>
+                <w:sz w:val="24"/>
+                <w:szCs w:val="24"/>
+              </w:rPr>
               <w:t xml:space="preserve">liability</w:t>
             </w:r>
             <w:r>
+              <w:rPr>
+                <w:sz w:val="24"/>
+                <w:szCs w:val="24"/>
+              </w:rPr>
               <w:t xml:space="preserve"> </w:t>
             </w:r>
             <w:r>
+              <w:rPr>
+                <w:sz w:val="24"/>
+                <w:szCs w:val="24"/>
+              </w:rPr>
               <w:t xml:space="preserve">company;</w:t>
             </w:r>
             <w:r>
+              <w:rPr>
+                <w:sz w:val="24"/>
+                <w:szCs w:val="24"/>
+              </w:rPr>
               <w:t xml:space="preserve"> </w:t>
             </w:r>
             <w:r>
+              <w:rPr>
+                <w:sz w:val="24"/>
+                <w:szCs w:val="24"/>
+              </w:rPr>
               <w:t xml:space="preserve">and</w:t>
             </w:r>
             <w:r>
+              <w:rPr>
+                <w:sz w:val="24"/>
+                <w:szCs w:val="24"/>
+              </w:rPr>
               <w:t xml:space="preserve"> </w:t>
             </w:r>
             <w:r>
+              <w:rPr>
+                <w:sz w:val="24"/>
+                <w:szCs w:val="24"/>
+              </w:rPr>
               <w:t xml:space="preserve">DOES</w:t>
             </w:r>
             <w:r>
+              <w:rPr>
+                <w:sz w:val="24"/>
+                <w:szCs w:val="24"/>
+              </w:rPr>
               <w:t xml:space="preserve"> </w:t>
             </w:r>
             <w:r>
+              <w:rPr>
+                <w:sz w:val="24"/>
+                <w:szCs w:val="24"/>
+              </w:rPr>
               <w:t xml:space="preserve">1</w:t>
             </w:r>
             <w:r>
+              <w:rPr>
+                <w:sz w:val="24"/>
+                <w:szCs w:val="24"/>
+              </w:rPr>
               <w:t xml:space="preserve"> </w:t>
             </w:r>
             <w:r>
+              <w:rPr>
+                <w:sz w:val="24"/>
+                <w:szCs w:val="24"/>
+              </w:rPr>
               <w:t xml:space="preserve">through</w:t>
             </w:r>
             <w:r>
+              <w:rPr>
+                <w:sz w:val="24"/>
+                <w:szCs w:val="24"/>
+              </w:rPr>
               <w:t xml:space="preserve"> </w:t>
             </w:r>
             <w:r>
+              <w:rPr>
+                <w:sz w:val="24"/>
+                <w:szCs w:val="24"/>
+              </w:rPr>
               <w:t xml:space="preserve">20,</w:t>
             </w:r>
             <w:r>
+              <w:rPr>
+                <w:sz w:val="24"/>
+                <w:szCs w:val="24"/>
+              </w:rPr>
               <w:t xml:space="preserve"> </w:t>
             </w:r>
             <w:r>
+              <w:rPr>
+                <w:sz w:val="24"/>
+                <w:szCs w:val="24"/>
+              </w:rPr>
               <w:t xml:space="preserve">inclusive,</w:t>
             </w:r>
           </w:p>
@@ -1297,6 +2225,10 @@
               <w:jc w:val="left"/>
             </w:pPr>
             <w:r>
+              <w:rPr>
+                <w:sz w:val="24"/>
+                <w:szCs w:val="24"/>
+              </w:rPr>
               <w:t xml:space="preserve">Defendants.</w:t>
             </w:r>
           </w:p>
@@ -1717,9 +2649,7 @@
         <w:t xml:space="preserve"> </w:t>
       </w:r>
       <w:r>
-        <w:t xml:space="preserve">9</w:t>
-        <w:noBreakHyphen/>
-        <w:t xml:space="preserve">406</w:t>
+        <w:t xml:space="preserve">9-⁠406</w:t>
       </w:r>
       <w:r>
         <w:t xml:space="preserve"> </w:t>
@@ -1731,9 +2661,7 @@
         <w:t xml:space="preserve"> </w:t>
       </w:r>
       <w:r>
-        <w:t xml:space="preserve">9</w:t>
-        <w:noBreakHyphen/>
-        <w:t xml:space="preserve">607</w:t>
+        <w:t xml:space="preserve">9-⁠607</w:t>
       </w:r>
       <w:r>
         <w:t xml:space="preserve"> </w:t>
@@ -2772,9 +3700,7 @@
         <w:t xml:space="preserve"> </w:t>
       </w:r>
       <w:r>
-        <w:t xml:space="preserve">26</w:t>
-        <w:noBreakHyphen/>
-        <w:t xml:space="preserve">10978,</w:t>
+        <w:t xml:space="preserve">26-⁠10978,</w:t>
       </w:r>
       <w:r>
         <w:t xml:space="preserve"> </w:t>
@@ -2810,65 +3736,49 @@
         <w:t xml:space="preserve"> </w:t>
       </w:r>
       <w:r>
-        <w:t xml:space="preserve">1:26-bk</w:t>
-        <w:noBreakHyphen/>
-        <w:t xml:space="preserve">10979,</w:t>
-      </w:r>
-      <w:r>
-        <w:t xml:space="preserve"> </w:t>
-      </w:r>
-      <w:r>
-        <w:t xml:space="preserve">1:26-bk</w:t>
-        <w:noBreakHyphen/>
-        <w:t xml:space="preserve">10980,</w:t>
-      </w:r>
-      <w:r>
-        <w:t xml:space="preserve"> </w:t>
-      </w:r>
-      <w:r>
-        <w:t xml:space="preserve">1:26-bk</w:t>
-        <w:noBreakHyphen/>
-        <w:t xml:space="preserve">10981,</w:t>
-      </w:r>
-      <w:r>
-        <w:t xml:space="preserve"> </w:t>
-      </w:r>
-      <w:r>
-        <w:t xml:space="preserve">1:26-bk</w:t>
-        <w:noBreakHyphen/>
-        <w:t xml:space="preserve">10982,</w:t>
-      </w:r>
-      <w:r>
-        <w:t xml:space="preserve"> </w:t>
-      </w:r>
-      <w:r>
-        <w:t xml:space="preserve">1:26-bk</w:t>
-        <w:noBreakHyphen/>
-        <w:t xml:space="preserve">10983,</w:t>
-      </w:r>
-      <w:r>
-        <w:t xml:space="preserve"> </w:t>
-      </w:r>
-      <w:r>
-        <w:t xml:space="preserve">1:26-bk</w:t>
-        <w:noBreakHyphen/>
-        <w:t xml:space="preserve">10984,</w:t>
-      </w:r>
-      <w:r>
-        <w:t xml:space="preserve"> </w:t>
-      </w:r>
-      <w:r>
-        <w:t xml:space="preserve">1:26-bk</w:t>
-        <w:noBreakHyphen/>
-        <w:t xml:space="preserve">10986,</w:t>
-      </w:r>
-      <w:r>
-        <w:t xml:space="preserve"> </w:t>
-      </w:r>
-      <w:r>
-        <w:t xml:space="preserve">1:26-bk</w:t>
-        <w:noBreakHyphen/>
-        <w:t xml:space="preserve">10987,</w:t>
+        <w:t xml:space="preserve">1:26-bk-⁠10979,</w:t>
+      </w:r>
+      <w:r>
+        <w:t xml:space="preserve"> </w:t>
+      </w:r>
+      <w:r>
+        <w:t xml:space="preserve">1:26-bk-⁠10980,</w:t>
+      </w:r>
+      <w:r>
+        <w:t xml:space="preserve"> </w:t>
+      </w:r>
+      <w:r>
+        <w:t xml:space="preserve">1:26-bk-⁠10981,</w:t>
+      </w:r>
+      <w:r>
+        <w:t xml:space="preserve"> </w:t>
+      </w:r>
+      <w:r>
+        <w:t xml:space="preserve">1:26-bk-⁠10982,</w:t>
+      </w:r>
+      <w:r>
+        <w:t xml:space="preserve"> </w:t>
+      </w:r>
+      <w:r>
+        <w:t xml:space="preserve">1:26-bk-⁠10983,</w:t>
+      </w:r>
+      <w:r>
+        <w:t xml:space="preserve"> </w:t>
+      </w:r>
+      <w:r>
+        <w:t xml:space="preserve">1:26-bk-⁠10984,</w:t>
+      </w:r>
+      <w:r>
+        <w:t xml:space="preserve"> </w:t>
+      </w:r>
+      <w:r>
+        <w:t xml:space="preserve">1:26-bk-⁠10986,</w:t>
+      </w:r>
+      <w:r>
+        <w:t xml:space="preserve"> </w:t>
+      </w:r>
+      <w:r>
+        <w:t xml:space="preserve">1:26-bk-⁠10987,</w:t>
       </w:r>
       <w:r>
         <w:t xml:space="preserve"> </w:t>
@@ -2880,9 +3790,7 @@
         <w:t xml:space="preserve"> </w:t>
       </w:r>
       <w:r>
-        <w:t xml:space="preserve">1:26-bk</w:t>
-        <w:noBreakHyphen/>
-        <w:t xml:space="preserve">10988.</w:t>
+        <w:t xml:space="preserve">1:26-bk-⁠10988.</w:t>
       </w:r>
       <w:r>
         <w:t xml:space="preserve"> </w:t>
@@ -5720,9 +6628,7 @@
         <w:t xml:space="preserve"> </w:t>
       </w:r>
       <w:r>
-        <w:t xml:space="preserve">9</w:t>
-        <w:noBreakHyphen/>
-        <w:t xml:space="preserve">309.</w:t>
+        <w:t xml:space="preserve">9-⁠309.</w:t>
       </w:r>
     </w:p>
     <w:p>
@@ -5964,9 +6870,7 @@
         <w:t xml:space="preserve"> </w:t>
       </w:r>
       <w:r>
-        <w:t xml:space="preserve">UCC</w:t>
-        <w:noBreakHyphen/>
-        <w:t xml:space="preserve">1</w:t>
+        <w:t xml:space="preserve">UCC-⁠1</w:t>
       </w:r>
       <w:r>
         <w:t xml:space="preserve"> </w:t>
@@ -6170,9 +7074,7 @@
         <w:t xml:space="preserve"> </w:t>
       </w:r>
       <w:r>
-        <w:t xml:space="preserve">UCC</w:t>
-        <w:noBreakHyphen/>
-        <w:t xml:space="preserve">1</w:t>
+        <w:t xml:space="preserve">UCC-⁠1</w:t>
       </w:r>
       <w:r>
         <w:t xml:space="preserve"> </w:t>
@@ -8668,9 +9570,7 @@
         <w:t xml:space="preserve"> </w:t>
       </w:r>
       <w:r>
-        <w:t xml:space="preserve">9</w:t>
-        <w:noBreakHyphen/>
-        <w:t xml:space="preserve">406</w:t>
+        <w:t xml:space="preserve">9-⁠406</w:t>
       </w:r>
       <w:r>
         <w:t xml:space="preserve"> </w:t>
@@ -8682,9 +9582,7 @@
         <w:t xml:space="preserve"> </w:t>
       </w:r>
       <w:r>
-        <w:t xml:space="preserve">9</w:t>
-        <w:noBreakHyphen/>
-        <w:t xml:space="preserve">607</w:t>
+        <w:t xml:space="preserve">9-⁠607</w:t>
       </w:r>
       <w:r>
         <w:t xml:space="preserve"> </w:t>
@@ -9503,9 +10401,7 @@
         <w:t xml:space="preserve"> </w:t>
       </w:r>
       <w:r>
-        <w:t xml:space="preserve">9</w:t>
-        <w:noBreakHyphen/>
-        <w:t xml:space="preserve">406</w:t>
+        <w:t xml:space="preserve">9-⁠406</w:t>
       </w:r>
       <w:r>
         <w:t xml:space="preserve"> </w:t>
@@ -9517,9 +10413,7 @@
         <w:t xml:space="preserve"> </w:t>
       </w:r>
       <w:r>
-        <w:t xml:space="preserve">9</w:t>
-        <w:noBreakHyphen/>
-        <w:t xml:space="preserve">607</w:t>
+        <w:t xml:space="preserve">9-⁠607</w:t>
       </w:r>
       <w:r>
         <w:t xml:space="preserve"> </w:t>
@@ -10132,9 +11026,7 @@
         <w:t xml:space="preserve"> </w:t>
       </w:r>
       <w:r>
-        <w:t xml:space="preserve">9</w:t>
-        <w:noBreakHyphen/>
-        <w:t xml:space="preserve">406</w:t>
+        <w:t xml:space="preserve">9-⁠406</w:t>
       </w:r>
       <w:r>
         <w:t xml:space="preserve"> </w:t>
@@ -10146,9 +11038,7 @@
         <w:t xml:space="preserve"> </w:t>
       </w:r>
       <w:r>
-        <w:t xml:space="preserve">9</w:t>
-        <w:noBreakHyphen/>
-        <w:t xml:space="preserve">607</w:t>
+        <w:t xml:space="preserve">9-⁠607</w:t>
       </w:r>
       <w:r>
         <w:t xml:space="preserve"> </w:t>
@@ -10979,9 +11869,7 @@
           <w:b/>
           <w:bCs/>
         </w:rPr>
-        <w:t xml:space="preserve">9</w:t>
-        <w:noBreakHyphen/>
-        <w:t xml:space="preserve">406</w:t>
+        <w:t xml:space="preserve">9-⁠406</w:t>
       </w:r>
       <w:r>
         <w:rPr>
@@ -11697,9 +12585,7 @@
         <w:t xml:space="preserve"> </w:t>
       </w:r>
       <w:r>
-        <w:t xml:space="preserve">9</w:t>
-        <w:noBreakHyphen/>
-        <w:t xml:space="preserve">406</w:t>
+        <w:t xml:space="preserve">9-⁠406</w:t>
       </w:r>
       <w:r>
         <w:t xml:space="preserve"> </w:t>
@@ -12102,9 +12988,7 @@
         <w:t xml:space="preserve"> </w:t>
       </w:r>
       <w:r>
-        <w:t xml:space="preserve">9</w:t>
-        <w:noBreakHyphen/>
-        <w:t xml:space="preserve">318(a)</w:t>
+        <w:t xml:space="preserve">9-⁠318(a)</w:t>
       </w:r>
       <w:r>
         <w:t xml:space="preserve"> </w:t>
@@ -14596,9 +15480,7 @@
         <w:t xml:space="preserve"> </w:t>
       </w:r>
       <w:r>
-        <w:t xml:space="preserve">9</w:t>
-        <w:noBreakHyphen/>
-        <w:t xml:space="preserve">406</w:t>
+        <w:t xml:space="preserve">9-⁠406</w:t>
       </w:r>
       <w:r>
         <w:t xml:space="preserve"> </w:t>
@@ -14610,9 +15492,7 @@
         <w:t xml:space="preserve"> </w:t>
       </w:r>
       <w:r>
-        <w:t xml:space="preserve">9</w:t>
-        <w:noBreakHyphen/>
-        <w:t xml:space="preserve">607</w:t>
+        <w:t xml:space="preserve">9-⁠607</w:t>
       </w:r>
       <w:r>
         <w:t xml:space="preserve"> </w:t>
@@ -14814,9 +15694,7 @@
         <w:t xml:space="preserve"> </w:t>
       </w:r>
       <w:r>
-        <w:t xml:space="preserve">9</w:t>
-        <w:noBreakHyphen/>
-        <w:t xml:space="preserve">406</w:t>
+        <w:t xml:space="preserve">9-⁠406</w:t>
       </w:r>
       <w:r>
         <w:t xml:space="preserve"> </w:t>
@@ -14828,9 +15706,7 @@
         <w:t xml:space="preserve"> </w:t>
       </w:r>
       <w:r>
-        <w:t xml:space="preserve">9</w:t>
-        <w:noBreakHyphen/>
-        <w:t xml:space="preserve">607</w:t>
+        <w:t xml:space="preserve">9-⁠607</w:t>
       </w:r>
       <w:r>
         <w:t xml:space="preserve"> </w:t>
@@ -15097,6 +15973,10 @@
               <w:jc w:val="left"/>
             </w:pPr>
             <w:r>
+              <w:rPr>
+                <w:sz w:val="24"/>
+                <w:szCs w:val="24"/>
+              </w:rPr>
               <w:t xml:space="preserve">Dated: April 21, 2026</w:t>
             </w:r>
           </w:p>
@@ -15107,6 +15987,10 @@
               <w:jc w:val="left"/>
             </w:pPr>
             <w:r>
+              <w:rPr>
+                <w:sz w:val="24"/>
+                <w:szCs w:val="24"/>
+              </w:rPr>
               <w:t xml:space="preserve">Dated: April 21, 2026</w:t>
             </w:r>
           </w:p>
@@ -15134,6 +16018,10 @@
               <w:jc w:val="left"/>
             </w:pPr>
             <w:r>
+              <w:rPr>
+                <w:sz w:val="24"/>
+                <w:szCs w:val="24"/>
+              </w:rPr>
               <w:t xml:space="preserve">Respectfully submitted,</w:t>
             </w:r>
           </w:p>
@@ -15144,18 +16032,38 @@
               <w:jc w:val="left"/>
             </w:pPr>
             <w:r>
+              <w:rPr>
+                <w:sz w:val="24"/>
+                <w:szCs w:val="24"/>
+              </w:rPr>
               <w:t xml:space="preserve">KAMINSKI</w:t>
             </w:r>
             <w:r>
+              <w:rPr>
+                <w:sz w:val="24"/>
+                <w:szCs w:val="24"/>
+              </w:rPr>
               <w:t xml:space="preserve"> </w:t>
             </w:r>
             <w:r>
+              <w:rPr>
+                <w:sz w:val="24"/>
+                <w:szCs w:val="24"/>
+              </w:rPr>
               <w:t xml:space="preserve">LAW,</w:t>
             </w:r>
             <w:r>
+              <w:rPr>
+                <w:sz w:val="24"/>
+                <w:szCs w:val="24"/>
+              </w:rPr>
               <w:t xml:space="preserve"> </w:t>
             </w:r>
             <w:r>
+              <w:rPr>
+                <w:sz w:val="24"/>
+                <w:szCs w:val="24"/>
+              </w:rPr>
               <w:t xml:space="preserve">PLLC</w:t>
             </w:r>
           </w:p>
@@ -15166,6 +16074,10 @@
               <w:jc w:val="left"/>
             </w:pPr>
             <w:r>
+              <w:rPr>
+                <w:sz w:val="24"/>
+                <w:szCs w:val="24"/>
+              </w:rPr>
               <w:t xml:space="preserve">By: /s/ Shanna M. Kaminski</w:t>
             </w:r>
           </w:p>
@@ -15176,6 +16088,10 @@
               <w:jc w:val="left"/>
             </w:pPr>
             <w:r>
+              <w:rPr>
+                <w:sz w:val="24"/>
+                <w:szCs w:val="24"/>
+              </w:rPr>
               <w:t xml:space="preserve">Shanna M. Kaminski</w:t>
             </w:r>
           </w:p>
@@ -15186,24 +16102,52 @@
               <w:jc w:val="left"/>
             </w:pPr>
             <w:r>
+              <w:rPr>
+                <w:sz w:val="24"/>
+                <w:szCs w:val="24"/>
+              </w:rPr>
               <w:t xml:space="preserve">Admitted</w:t>
             </w:r>
             <w:r>
+              <w:rPr>
+                <w:sz w:val="24"/>
+                <w:szCs w:val="24"/>
+              </w:rPr>
               <w:t xml:space="preserve"> </w:t>
             </w:r>
             <w:r>
+              <w:rPr>
+                <w:sz w:val="24"/>
+                <w:szCs w:val="24"/>
+              </w:rPr>
               <w:t xml:space="preserve">pro</w:t>
             </w:r>
             <w:r>
+              <w:rPr>
+                <w:sz w:val="24"/>
+                <w:szCs w:val="24"/>
+              </w:rPr>
               <w:t xml:space="preserve"> </w:t>
             </w:r>
             <w:r>
+              <w:rPr>
+                <w:sz w:val="24"/>
+                <w:szCs w:val="24"/>
+              </w:rPr>
               <w:t xml:space="preserve">hac</w:t>
             </w:r>
             <w:r>
+              <w:rPr>
+                <w:sz w:val="24"/>
+                <w:szCs w:val="24"/>
+              </w:rPr>
               <w:t xml:space="preserve"> </w:t>
             </w:r>
             <w:r>
+              <w:rPr>
+                <w:sz w:val="24"/>
+                <w:szCs w:val="24"/>
+              </w:rPr>
               <w:t xml:space="preserve">vice</w:t>
             </w:r>
           </w:p>
@@ -15214,30 +16158,66 @@
               <w:jc w:val="left"/>
             </w:pPr>
             <w:r>
+              <w:rPr>
+                <w:sz w:val="24"/>
+                <w:szCs w:val="24"/>
+              </w:rPr>
               <w:t xml:space="preserve">Attorneys</w:t>
             </w:r>
             <w:r>
+              <w:rPr>
+                <w:sz w:val="24"/>
+                <w:szCs w:val="24"/>
+              </w:rPr>
               <w:t xml:space="preserve"> </w:t>
             </w:r>
             <w:r>
+              <w:rPr>
+                <w:sz w:val="24"/>
+                <w:szCs w:val="24"/>
+              </w:rPr>
               <w:t xml:space="preserve">for</w:t>
             </w:r>
             <w:r>
+              <w:rPr>
+                <w:sz w:val="24"/>
+                <w:szCs w:val="24"/>
+              </w:rPr>
               <w:t xml:space="preserve"> </w:t>
             </w:r>
             <w:r>
+              <w:rPr>
+                <w:sz w:val="24"/>
+                <w:szCs w:val="24"/>
+              </w:rPr>
               <w:t xml:space="preserve">DLP</w:t>
             </w:r>
             <w:r>
+              <w:rPr>
+                <w:sz w:val="24"/>
+                <w:szCs w:val="24"/>
+              </w:rPr>
               <w:t xml:space="preserve"> </w:t>
             </w:r>
             <w:r>
+              <w:rPr>
+                <w:sz w:val="24"/>
+                <w:szCs w:val="24"/>
+              </w:rPr>
               <w:t xml:space="preserve">FUNDING</w:t>
             </w:r>
             <w:r>
+              <w:rPr>
+                <w:sz w:val="24"/>
+                <w:szCs w:val="24"/>
+              </w:rPr>
               <w:t xml:space="preserve"> </w:t>
             </w:r>
             <w:r>
+              <w:rPr>
+                <w:sz w:val="24"/>
+                <w:szCs w:val="24"/>
+              </w:rPr>
               <w:t xml:space="preserve">LLC</w:t>
             </w:r>
           </w:p>
@@ -15248,6 +16228,10 @@
               <w:jc w:val="left"/>
             </w:pPr>
             <w:r>
+              <w:rPr>
+                <w:sz w:val="24"/>
+                <w:szCs w:val="24"/>
+              </w:rPr>
               <w:t xml:space="preserve">Respectfully submitted,</w:t>
             </w:r>
           </w:p>
@@ -15258,18 +16242,38 @@
               <w:jc w:val="left"/>
             </w:pPr>
             <w:r>
+              <w:rPr>
+                <w:sz w:val="24"/>
+                <w:szCs w:val="24"/>
+              </w:rPr>
               <w:t xml:space="preserve">SALVATO</w:t>
             </w:r>
             <w:r>
+              <w:rPr>
+                <w:sz w:val="24"/>
+                <w:szCs w:val="24"/>
+              </w:rPr>
               <w:t xml:space="preserve"> </w:t>
             </w:r>
             <w:r>
+              <w:rPr>
+                <w:sz w:val="24"/>
+                <w:szCs w:val="24"/>
+              </w:rPr>
               <w:t xml:space="preserve">BOUFADEL</w:t>
             </w:r>
             <w:r>
+              <w:rPr>
+                <w:sz w:val="24"/>
+                <w:szCs w:val="24"/>
+              </w:rPr>
               <w:t xml:space="preserve"> </w:t>
             </w:r>
             <w:r>
+              <w:rPr>
+                <w:sz w:val="24"/>
+                <w:szCs w:val="24"/>
+              </w:rPr>
               <w:t xml:space="preserve">LLP</w:t>
             </w:r>
           </w:p>
@@ -15280,6 +16284,10 @@
               <w:jc w:val="left"/>
             </w:pPr>
             <w:r>
+              <w:rPr>
+                <w:sz w:val="24"/>
+                <w:szCs w:val="24"/>
+              </w:rPr>
               <w:t xml:space="preserve">By: /s/ Joseph Boufadel</w:t>
             </w:r>
           </w:p>
@@ -15290,6 +16298,10 @@
               <w:jc w:val="left"/>
             </w:pPr>
             <w:r>
+              <w:rPr>
+                <w:sz w:val="24"/>
+                <w:szCs w:val="24"/>
+              </w:rPr>
               <w:t xml:space="preserve">Joseph Boufadel</w:t>
             </w:r>
           </w:p>
@@ -15300,18 +16312,38 @@
               <w:jc w:val="left"/>
             </w:pPr>
             <w:r>
+              <w:rPr>
+                <w:sz w:val="24"/>
+                <w:szCs w:val="24"/>
+              </w:rPr>
               <w:t xml:space="preserve">Gregory</w:t>
             </w:r>
             <w:r>
+              <w:rPr>
+                <w:sz w:val="24"/>
+                <w:szCs w:val="24"/>
+              </w:rPr>
               <w:t xml:space="preserve"> </w:t>
             </w:r>
             <w:r>
+              <w:rPr>
+                <w:sz w:val="24"/>
+                <w:szCs w:val="24"/>
+              </w:rPr>
               <w:t xml:space="preserve">M.</w:t>
             </w:r>
             <w:r>
+              <w:rPr>
+                <w:sz w:val="24"/>
+                <w:szCs w:val="24"/>
+              </w:rPr>
               <w:t xml:space="preserve"> </w:t>
             </w:r>
             <w:r>
+              <w:rPr>
+                <w:sz w:val="24"/>
+                <w:szCs w:val="24"/>
+              </w:rPr>
               <w:t xml:space="preserve">Salvato</w:t>
             </w:r>
           </w:p>
@@ -15322,36 +16354,80 @@
               <w:jc w:val="left"/>
             </w:pPr>
             <w:r>
+              <w:rPr>
+                <w:sz w:val="24"/>
+                <w:szCs w:val="24"/>
+              </w:rPr>
               <w:t xml:space="preserve">Local</w:t>
             </w:r>
             <w:r>
+              <w:rPr>
+                <w:sz w:val="24"/>
+                <w:szCs w:val="24"/>
+              </w:rPr>
               <w:t xml:space="preserve"> </w:t>
             </w:r>
             <w:r>
+              <w:rPr>
+                <w:sz w:val="24"/>
+                <w:szCs w:val="24"/>
+              </w:rPr>
               <w:t xml:space="preserve">Counsel</w:t>
             </w:r>
             <w:r>
+              <w:rPr>
+                <w:sz w:val="24"/>
+                <w:szCs w:val="24"/>
+              </w:rPr>
               <w:t xml:space="preserve"> </w:t>
             </w:r>
             <w:r>
+              <w:rPr>
+                <w:sz w:val="24"/>
+                <w:szCs w:val="24"/>
+              </w:rPr>
               <w:t xml:space="preserve">for</w:t>
             </w:r>
             <w:r>
+              <w:rPr>
+                <w:sz w:val="24"/>
+                <w:szCs w:val="24"/>
+              </w:rPr>
               <w:t xml:space="preserve"> </w:t>
             </w:r>
             <w:r>
+              <w:rPr>
+                <w:sz w:val="24"/>
+                <w:szCs w:val="24"/>
+              </w:rPr>
               <w:t xml:space="preserve">DLP</w:t>
             </w:r>
             <w:r>
+              <w:rPr>
+                <w:sz w:val="24"/>
+                <w:szCs w:val="24"/>
+              </w:rPr>
               <w:t xml:space="preserve"> </w:t>
             </w:r>
             <w:r>
+              <w:rPr>
+                <w:sz w:val="24"/>
+                <w:szCs w:val="24"/>
+              </w:rPr>
               <w:t xml:space="preserve">FUNDING</w:t>
             </w:r>
             <w:r>
+              <w:rPr>
+                <w:sz w:val="24"/>
+                <w:szCs w:val="24"/>
+              </w:rPr>
               <w:t xml:space="preserve"> </w:t>
             </w:r>
             <w:r>
+              <w:rPr>
+                <w:sz w:val="24"/>
+                <w:szCs w:val="24"/>
+              </w:rPr>
               <w:t xml:space="preserve">LLC</w:t>
             </w:r>
           </w:p>

</xml_diff>